<commit_message>
removed redundant files and fixed week 7 methodology
</commit_message>
<xml_diff>
--- a/week 5/methodology/Methodology.docx
+++ b/week 5/methodology/Methodology.docx
@@ -5,12 +5,14 @@
     <w:p>
       <w:pPr>
         <w:spacing w:after="120"/>
+        <w:jc w:val="center"/>
         <w:rPr>
           <w:rFonts w:ascii="Times New Roman" w:hAnsi="Times New Roman" w:cs="Times New Roman"/>
           <w:b/>
           <w:bCs/>
-          <w:sz w:val="32"/>
-          <w:szCs w:val="32"/>
+          <w:sz w:val="40"/>
+          <w:szCs w:val="40"/>
+          <w:u w:val="single"/>
         </w:rPr>
       </w:pPr>
       <w:r>
@@ -18,8 +20,9 @@
           <w:rFonts w:ascii="Times New Roman" w:hAnsi="Times New Roman" w:cs="Times New Roman"/>
           <w:b/>
           <w:bCs/>
-          <w:sz w:val="32"/>
-          <w:szCs w:val="32"/>
+          <w:sz w:val="40"/>
+          <w:szCs w:val="40"/>
+          <w:u w:val="single"/>
         </w:rPr>
         <w:t>Smart Carbon Footprint Tracking and Recommendation System for Urban Households</w:t>
       </w:r>
@@ -545,6 +548,7 @@
           <w:rFonts w:ascii="Times New Roman" w:hAnsi="Times New Roman" w:cs="Times New Roman"/>
           <w:szCs w:val="24"/>
         </w:rPr>
+        <w:lastRenderedPageBreak/>
         <w:t>Dashboard rendering</w:t>
       </w:r>
     </w:p>
@@ -565,7 +569,6 @@
           <w:rFonts w:ascii="Times New Roman" w:hAnsi="Times New Roman" w:cs="Times New Roman"/>
           <w:szCs w:val="24"/>
         </w:rPr>
-        <w:lastRenderedPageBreak/>
         <w:t>Sustainability goal tracking</w:t>
       </w:r>
     </w:p>
@@ -1239,7 +1242,6 @@
           <w:bCs/>
           <w:szCs w:val="24"/>
         </w:rPr>
-        <w:lastRenderedPageBreak/>
         <w:t>5. Data Processing Approach</w:t>
       </w:r>
     </w:p>
@@ -1798,6 +1800,7 @@
           <w:rFonts w:ascii="Times New Roman" w:hAnsi="Times New Roman" w:cs="Times New Roman"/>
           <w:szCs w:val="24"/>
         </w:rPr>
+        <w:lastRenderedPageBreak/>
         <w:t>Continuous feedback integration</w:t>
       </w:r>
     </w:p>
@@ -1838,7 +1841,6 @@
           <w:rFonts w:ascii="Times New Roman" w:hAnsi="Times New Roman" w:cs="Times New Roman"/>
           <w:szCs w:val="24"/>
         </w:rPr>
-        <w:lastRenderedPageBreak/>
         <w:t xml:space="preserve">Progressive enhancement of system functionality </w:t>
       </w:r>
     </w:p>
@@ -3978,6 +3980,7 @@
   <w:style w:type="character" w:default="1" w:styleId="DefaultParagraphFont">
     <w:name w:val="Default Paragraph Font"/>
     <w:uiPriority w:val="1"/>
+    <w:semiHidden/>
     <w:unhideWhenUsed/>
   </w:style>
   <w:style w:type="table" w:default="1" w:styleId="TableNormal">

</xml_diff>